<commit_message>
Implement Type IV motif handling: skip and mark unchanged in decision matrix
</commit_message>
<xml_diff>
--- a/README/Sytogen_Detailed_Beginner_Guide.docx
+++ b/README/Sytogen_Detailed_Beginner_Guide.docx
@@ -281,7 +281,13 @@
         <w:pStyle w:val="ListNumber"/>
       </w:pPr>
       <w:r>
-        <w:t>After installation, open PowerShell.</w:t>
+        <w:t xml:space="preserve">After installation, open </w:t>
+      </w:r>
+      <w:r>
+        <w:t>Command Prompt</w:t>
+      </w:r>
+      <w:r>
+        <w:t>.</w:t>
       </w:r>
     </w:p>
     <w:p>
@@ -334,73 +340,6 @@
         <w:pStyle w:val="Heading1"/>
       </w:pPr>
       <w:r>
-        <w:t xml:space="preserve">3. Open </w:t>
-      </w:r>
-      <w:r>
-        <w:t>Command Prompt</w:t>
-      </w:r>
-    </w:p>
-    <w:p>
-      <w:r>
-        <w:t>Command Prompt is the</w:t>
-      </w:r>
-      <w:r>
-        <w:t xml:space="preserve"> command line interface.</w:t>
-      </w:r>
-    </w:p>
-    <w:p>
-      <w:pPr>
-        <w:pStyle w:val="ListNumber"/>
-      </w:pPr>
-      <w:r>
-        <w:t>Select the Windows Start button.</w:t>
-      </w:r>
-    </w:p>
-    <w:p>
-      <w:pPr>
-        <w:pStyle w:val="ListNumber"/>
-      </w:pPr>
-      <w:r>
-        <w:t>Type</w:t>
-      </w:r>
-      <w:r>
-        <w:t>:</w:t>
-      </w:r>
-      <w:r>
-        <w:t xml:space="preserve"> </w:t>
-      </w:r>
-    </w:p>
-    <w:p>
-      <w:pPr>
-        <w:pStyle w:val="ListNumber"/>
-        <w:numPr>
-          <w:ilvl w:val="0"/>
-          <w:numId w:val="0"/>
-        </w:numPr>
-        <w:ind w:left="360" w:firstLine="360"/>
-      </w:pPr>
-      <w:r>
-        <w:rPr>
-          <w:rFonts w:ascii="Consolas" w:hAnsi="Consolas" w:cs="Consolas"/>
-          <w:sz w:val="20"/>
-          <w:szCs w:val="20"/>
-        </w:rPr>
-        <w:t>Command Prompt</w:t>
-      </w:r>
-    </w:p>
-    <w:p>
-      <w:pPr>
-        <w:pStyle w:val="ListNumber"/>
-      </w:pPr>
-      <w:r>
-        <w:t>Open Command Prompt</w:t>
-      </w:r>
-    </w:p>
-    <w:p>
-      <w:pPr>
-        <w:pStyle w:val="Heading1"/>
-      </w:pPr>
-      <w:r>
         <w:t>4. Create a Working Folder</w:t>
       </w:r>
     </w:p>
@@ -594,16 +533,14 @@
           <w:szCs w:val="20"/>
         </w:rPr>
       </w:pPr>
-      <w:proofErr w:type="spellStart"/>
       <w:r>
         <w:rPr>
           <w:rFonts w:ascii="Consolas" w:hAnsi="Consolas" w:cs="Consolas"/>
           <w:sz w:val="20"/>
           <w:szCs w:val="20"/>
         </w:rPr>
-        <w:t>dir</w:t>
-      </w:r>
-      <w:proofErr w:type="spellEnd"/>
+        <w:t>ls</w:t>
+      </w:r>
     </w:p>
     <w:p>
       <w:pPr>
@@ -686,7 +623,6 @@
         <w:pStyle w:val="ListNumber"/>
       </w:pPr>
       <w:r>
-        <w:lastRenderedPageBreak/>
         <w:t>Type</w:t>
       </w:r>
       <w:r>
@@ -795,6 +731,7 @@
         <w:pStyle w:val="Heading1"/>
       </w:pPr>
       <w:r>
+        <w:lastRenderedPageBreak/>
         <w:t>7. Activate the Virtual Environment</w:t>
       </w:r>
     </w:p>
@@ -895,7 +832,21 @@
       </w:r>
       <w:proofErr w:type="spellEnd"/>
       <w:r>
-        <w:t>) PS C:\Projects\Sytogen&gt;</w:t>
+        <w:t xml:space="preserve">) </w:t>
+      </w:r>
+      <w:r>
+        <w:t>&gt;</w:t>
+      </w:r>
+      <w:r>
+        <w:t>Projects\</w:t>
+      </w:r>
+      <w:proofErr w:type="spellStart"/>
+      <w:r>
+        <w:t>Sytogen</w:t>
+      </w:r>
+      <w:proofErr w:type="spellEnd"/>
+      <w:r>
+        <w:t>&gt;</w:t>
       </w:r>
     </w:p>
     <w:p>
@@ -944,6 +895,9 @@
       <w:r>
         <w:t>Wait for the update to complete.</w:t>
       </w:r>
+      <w:r>
+        <w:t xml:space="preserve"> This might not need upgrading and will state it is up to date.</w:t>
+      </w:r>
     </w:p>
     <w:p>
       <w:pPr>
@@ -1168,13 +1122,15 @@
       <w:r>
         <w:t>Copy the address into a web browser if it does not open automatically.</w:t>
       </w:r>
+      <w:r>
+        <w:t xml:space="preserve"> Microsoft Edge will not work. Choose another browser.</w:t>
+      </w:r>
     </w:p>
     <w:p>
       <w:pPr>
         <w:pStyle w:val="Heading1"/>
       </w:pPr>
       <w:r>
-        <w:lastRenderedPageBreak/>
         <w:t>1</w:t>
       </w:r>
       <w:r>
@@ -1277,6 +1233,7 @@
         <w:pStyle w:val="ListNumber"/>
       </w:pPr>
       <w:r>
+        <w:lastRenderedPageBreak/>
         <w:t xml:space="preserve">Activate the virtual environment: </w:t>
       </w:r>
     </w:p>
@@ -1344,16 +1301,7 @@
           <w:sz w:val="20"/>
           <w:szCs w:val="20"/>
         </w:rPr>
-        <w:t xml:space="preserve">git </w:t>
-      </w:r>
-      <w:proofErr w:type="spellStart"/>
-      <w:r>
-        <w:rPr>
-          <w:rFonts w:ascii="Consolas" w:hAnsi="Consolas" w:cs="Consolas"/>
-          <w:sz w:val="20"/>
-          <w:szCs w:val="20"/>
-        </w:rPr>
-        <w:t>pull</w:t>
+        <w:t>git pull</w:t>
       </w:r>
     </w:p>
     <w:p>
@@ -1370,7 +1318,6 @@
           <w:szCs w:val="20"/>
         </w:rPr>
       </w:pPr>
-      <w:proofErr w:type="spellEnd"/>
       <w:r>
         <w:rPr>
           <w:rFonts w:ascii="Consolas" w:hAnsi="Consolas" w:cs="Consolas"/>
@@ -1681,7 +1628,7 @@
   <w:abstractNum w:abstractNumId="7" w15:restartNumberingAfterBreak="0">
     <w:nsid w:val="FFFFFF88"/>
     <w:multiLevelType w:val="singleLevel"/>
-    <w:tmpl w:val="D0A62B40"/>
+    <w:tmpl w:val="94B0A5AA"/>
     <w:lvl w:ilvl="0">
       <w:start w:val="1"/>
       <w:numFmt w:val="decimal"/>
@@ -1743,6 +1690,9 @@
   </w:num>
   <w:num w:numId="9" w16cid:durableId="798230393">
     <w:abstractNumId w:val="0"/>
+  </w:num>
+  <w:num w:numId="10" w16cid:durableId="2132623595">
+    <w:abstractNumId w:val="7"/>
   </w:num>
 </w:numbering>
 </file>
@@ -2350,6 +2300,7 @@
   <w:style w:type="character" w:default="1" w:styleId="DefaultParagraphFont">
     <w:name w:val="Default Paragraph Font"/>
     <w:uiPriority w:val="1"/>
+    <w:semiHidden/>
     <w:unhideWhenUsed/>
   </w:style>
   <w:style w:type="table" w:default="1" w:styleId="TableNormal">

</xml_diff>